<commit_message>
Audit script_3 against notebook cell order and add Word version
Full pass over script_3 mirroring the script_1/script_2 audits: fix
two cell-order violations found by comparing the script against the
notebook's actual cell sequence (the Nelson-Aalen cumulative-hazard
plot was narrated after the Chat question about it instead of before,
and the Cox survival-curves-by-sex plot was narrated after the
"how can lifelines draw this without a baseline hazard" Chat question
instead of before it, reversing what is actually a "here's the result,
now explain how" flow). Verified all 12 Chat Q&A pairs answer every
part of their question and that lead-ins match the actual questions;
no further issues found. Added the Word (.docx) version alongside the
existing PDF.

Co-Authored-By: Claude Sonnet 5 <noreply@anthropic.com>
</commit_message>
<xml_diff>
--- a/3_survival_analysis/script_3_survival_analysis.docx
+++ b/3_survival_analysis/script_3_survival_analysis.docx
@@ -676,7 +676,7 @@
           <w:sz w:val="25"/>
           <w:rtl/>
         </w:rPr>
-        <w:t>עוד מדד שימושי, שקשור ישירות לעקומת קפלן-מאייר: הסיכון המצטבר. שאלתי את הצ'אט למה לא פשוט לקחת מינוס לוגריתם של קפלן-מאייר כדי לקבל אותו, במקום לבנות אומדן נפרד:</w:t>
+        <w:t>עוד מדד שימושי, שקשור ישירות לעקומת קפלן-מאייר: הסיכון המצטבר. הגרף שלו: ציר ה-X ימים, ציר ה-Y סיכון מצטבר, וקו שעולה במדרגות, כיוון הפוך מקפלן-מאייר, שיורד. שאלתי את הצ'אט למה לא פשוט לקחת מינוס לוגריתם של קפלן-מאייר כדי לקבל אותו, במקום לבנות אומדן נפרד:</w:t>
       </w:r>
     </w:p>
     <w:p>
@@ -728,23 +728,6 @@
           <w:rtl/>
         </w:rPr>
         <w:t>והוא ענה שפונקציית מינוס-לוגריתם קמורה, ולפי אי-שוויון ינסן הציפייה שלה תמיד גדולה או שווה למינוס-לוגריתם של הציפייה, כך שהקיצור הזה מטה כלפי מעלה את הסיכון המצטבר המוערך. אומדן נלסון-אאלן מחשב את הסיכון המצטבר ישירות מהנתונים ונמנע מהבעיה מהמקור.</w:t>
-      </w:r>
-    </w:p>
-    <w:p>
-      <w:pPr>
-        <w:bidi/>
-        <w:spacing w:after="160" w:before="0"/>
-        <w:jc w:val="both"/>
-      </w:pPr>
-      <w:r>
-        <w:rPr>
-          <w:rFonts w:ascii="David" w:hAnsi="David" w:cs="David" w:eastAsia="David"/>
-          <w:b w:val="0"/>
-          <w:i w:val="0"/>
-          <w:sz w:val="25"/>
-          <w:rtl/>
-        </w:rPr>
-        <w:t>הגרף שלו: ציר ה-X ימים, ציר ה-Y סיכון מצטבר, וקו שעולה במדרגות, כיוון הפוך מקפלן-מאייר, שיורד.</w:t>
       </w:r>
     </w:p>
     <w:p>
@@ -1031,7 +1014,24 @@
           <w:sz w:val="25"/>
           <w:rtl/>
         </w:rPr>
-        <w:t>שאלתי את הצ'אט שאלה שהטרידה אותי: אם מודל קוקס אף פעם לא אמד את פונקציית הסיכון הבסיסית במפורש, איך בכלל אפשר לצייר ממנו עקומת שרידות קונקרטית?</w:t>
+        <w:t>שתי עקומות שרידות זו לצד זו, לגברים ולנשים: ציר ה-X ימים, ציר ה-Y הסתברות שרידות משוערת, ושאר המשתנים קבועים בממוצע שלהם עבור שתי העקומות, כך שההבדל היחיד ביניהן הוא המין. רואים חזותית בדיוק את אותו פער שכבר ראינו במבחן לוג-ראנק, רק שהפעם עם שאר המשתנים מבוקרים.</w:t>
+      </w:r>
+    </w:p>
+    <w:p>
+      <w:pPr>
+        <w:bidi/>
+        <w:spacing w:after="160" w:before="0"/>
+        <w:jc w:val="both"/>
+      </w:pPr>
+      <w:r>
+        <w:rPr>
+          <w:rFonts w:ascii="David" w:hAnsi="David" w:cs="David" w:eastAsia="David"/>
+          <w:b w:val="0"/>
+          <w:i w:val="0"/>
+          <w:sz w:val="25"/>
+          <w:rtl/>
+        </w:rPr>
+        <w:t>שאלתי את הצ'אט שאלה שהטרידה אותי: אם מודל קוקס אף פעם לא אמד את פונקציית הסיכון הבסיסית במפורש, איך בכלל הצליחו לצייר ממנו עקומת שרידות קונקרטית כמו זו?</w:t>
       </w:r>
     </w:p>
     <w:p>
@@ -1083,23 +1083,6 @@
           <w:rtl/>
         </w:rPr>
         <w:t>והוא ענה שזה קורה דרך אומדן ברסלו: אחרי שיש לנו את המקדמים מהנראות החלקית, אומדים את הסיכון המצטבר הבסיסי בצורה לא-פרמטרית מאותם נתונים, ואז משלבים אותו עם כל פרופיל משתנים שרוצים, כדי לקבל עקומה קונקרטית וניתנת לציור.</w:t>
-      </w:r>
-    </w:p>
-    <w:p>
-      <w:pPr>
-        <w:bidi/>
-        <w:spacing w:after="160" w:before="0"/>
-        <w:jc w:val="both"/>
-      </w:pPr>
-      <w:r>
-        <w:rPr>
-          <w:rFonts w:ascii="David" w:hAnsi="David" w:cs="David" w:eastAsia="David"/>
-          <w:b w:val="0"/>
-          <w:i w:val="0"/>
-          <w:sz w:val="25"/>
-          <w:rtl/>
-        </w:rPr>
-        <w:t>שתי עקומות שרידות זו לצד זו, לגברים ולנשים: ציר ה-X ימים, ציר ה-Y הסתברות שרידות משוערת, ושאר המשתנים קבועים בממוצע שלהם עבור שתי העקומות, כך שההבדל היחיד ביניהן הוא המין. רואים חזותית בדיוק את אותו פער שכבר ראינו במבחן לוג-ראנק, רק שהפעם עם שאר המשתנים מבוקרים.</w:t>
       </w:r>
     </w:p>
     <w:p>

</xml_diff>